<commit_message>
I thought these were already commited?
</commit_message>
<xml_diff>
--- a/144/DQ Templates and Instructions/Topic 5 DQ 2/Guidance for Topic 5 DQ 2.docx
+++ b/144/DQ Templates and Instructions/Topic 5 DQ 2/Guidance for Topic 5 DQ 2.docx
@@ -1,6 +1,6 @@
 
 <file path=word/document.xml><?xml version="1.0" encoding="utf-8"?>
-<w:document xmlns:wpc="http://schemas.microsoft.com/office/word/2010/wordprocessingCanvas" xmlns:cx="http://schemas.microsoft.com/office/drawing/2014/chartex" xmlns:cx1="http://schemas.microsoft.com/office/drawing/2015/9/8/chartex" xmlns:cx2="http://schemas.microsoft.com/office/drawing/2015/10/21/chartex" xmlns:cx3="http://schemas.microsoft.com/office/drawing/2016/5/9/chartex" xmlns:cx4="http://schemas.microsoft.com/office/drawing/2016/5/10/chartex" xmlns:cx5="http://schemas.microsoft.com/office/drawing/2016/5/11/chartex" xmlns:cx6="http://schemas.microsoft.com/office/drawing/2016/5/12/chartex" xmlns:cx7="http://schemas.microsoft.com/office/drawing/2016/5/13/chartex" xmlns:cx8="http://schemas.microsoft.com/office/drawing/2016/5/14/chartex" xmlns:mc="http://schemas.openxmlformats.org/markup-compatibility/2006" xmlns:aink="http://schemas.microsoft.com/office/drawing/2016/ink" xmlns:am3d="http://schemas.microsoft.com/office/drawing/2017/model3d" xmlns:o="urn:schemas-microsoft-com:office:office" xmlns:oel="http://schemas.microsoft.com/office/2019/extlst" xmlns:r="http://schemas.openxmlformats.org/officeDocument/2006/relationships" xmlns:m="http://schemas.openxmlformats.org/officeDocument/2006/math" xmlns:v="urn:schemas-microsoft-com:vml" xmlns:wp14="http://schemas.microsoft.com/office/word/2010/wordprocessingDrawing" xmlns:wp="http://schemas.openxmlformats.org/drawingml/2006/wordprocessingDrawing" xmlns:w10="urn:schemas-microsoft-com:office:word" xmlns:w="http://schemas.openxmlformats.org/wordprocessingml/2006/main" xmlns:w14="http://schemas.microsoft.com/office/word/2010/wordml" xmlns:w15="http://schemas.microsoft.com/office/word/2012/wordml" xmlns:w16cex="http://schemas.microsoft.com/office/word/2018/wordml/cex" xmlns:w16cid="http://schemas.microsoft.com/office/word/2016/wordml/cid" xmlns:w16="http://schemas.microsoft.com/office/word/2018/wordml" xmlns:w16sdtdh="http://schemas.microsoft.com/office/word/2020/wordml/sdtdatahash" xmlns:w16se="http://schemas.microsoft.com/office/word/2015/wordml/symex" xmlns:wpg="http://schemas.microsoft.com/office/word/2010/wordprocessingGroup" xmlns:wpi="http://schemas.microsoft.com/office/word/2010/wordprocessingInk" xmlns:wne="http://schemas.microsoft.com/office/word/2006/wordml" xmlns:wps="http://schemas.microsoft.com/office/word/2010/wordprocessingShape" mc:Ignorable="w14 w15 w16se w16cid w16 w16cex w16sdtdh wp14">
+<w:document xmlns:wpc="http://schemas.microsoft.com/office/word/2010/wordprocessingCanvas" xmlns:cx="http://schemas.microsoft.com/office/drawing/2014/chartex" xmlns:cx1="http://schemas.microsoft.com/office/drawing/2015/9/8/chartex" xmlns:cx2="http://schemas.microsoft.com/office/drawing/2015/10/21/chartex" xmlns:cx3="http://schemas.microsoft.com/office/drawing/2016/5/9/chartex" xmlns:cx4="http://schemas.microsoft.com/office/drawing/2016/5/10/chartex" xmlns:cx5="http://schemas.microsoft.com/office/drawing/2016/5/11/chartex" xmlns:cx6="http://schemas.microsoft.com/office/drawing/2016/5/12/chartex" xmlns:cx7="http://schemas.microsoft.com/office/drawing/2016/5/13/chartex" xmlns:cx8="http://schemas.microsoft.com/office/drawing/2016/5/14/chartex" xmlns:mc="http://schemas.openxmlformats.org/markup-compatibility/2006" xmlns:aink="http://schemas.microsoft.com/office/drawing/2016/ink" xmlns:am3d="http://schemas.microsoft.com/office/drawing/2017/model3d" xmlns:o="urn:schemas-microsoft-com:office:office" xmlns:oel="http://schemas.microsoft.com/office/2019/extlst" xmlns:r="http://schemas.openxmlformats.org/officeDocument/2006/relationships" xmlns:m="http://schemas.openxmlformats.org/officeDocument/2006/math" xmlns:v="urn:schemas-microsoft-com:vml" xmlns:wp14="http://schemas.microsoft.com/office/word/2010/wordprocessingDrawing" xmlns:wp="http://schemas.openxmlformats.org/drawingml/2006/wordprocessingDrawing" xmlns:w10="urn:schemas-microsoft-com:office:word" xmlns:w="http://schemas.openxmlformats.org/wordprocessingml/2006/main" xmlns:w14="http://schemas.microsoft.com/office/word/2010/wordml" xmlns:w15="http://schemas.microsoft.com/office/word/2012/wordml" xmlns:w16cei="http://schemas.microsoft.com/office/word/2026/wordml/cei" xmlns:w16cex="http://schemas.microsoft.com/office/word/2018/wordml/cex" xmlns:w16cid="http://schemas.microsoft.com/office/word/2016/wordml/cid" xmlns:w16="http://schemas.microsoft.com/office/word/2018/wordml" xmlns:w16du="http://schemas.microsoft.com/office/word/2023/wordml/word16du" xmlns:w16sdtdh="http://schemas.microsoft.com/office/word/2020/wordml/sdtdatahash" xmlns:w16sdtfl="http://schemas.microsoft.com/office/word/2024/wordml/sdtformatlock" xmlns:w16se="http://schemas.microsoft.com/office/word/2015/wordml/symex" xmlns:wpg="http://schemas.microsoft.com/office/word/2010/wordprocessingGroup" xmlns:wpi="http://schemas.microsoft.com/office/word/2010/wordprocessingInk" xmlns:wne="http://schemas.microsoft.com/office/word/2006/wordml" xmlns:wps="http://schemas.microsoft.com/office/word/2010/wordprocessingShape" mc:Ignorable="w14 w15 w16se w16cid w16 w16cex w16sdtdh w16sdtfl w16du wp14">
   <w:body>
     <w:p>
       <w:pPr>
@@ -164,25 +164,7 @@
           <w:sz w:val="24"/>
           <w:szCs w:val="24"/>
         </w:rPr>
-        <w:t>=</w:t>
-      </w:r>
-      <w:proofErr w:type="gramStart"/>
-      <w:r>
-        <w:rPr>
-          <w:rFonts w:ascii="Times New Roman" w:hAnsi="Times New Roman" w:cs="Times New Roman"/>
-          <w:sz w:val="24"/>
-          <w:szCs w:val="24"/>
-        </w:rPr>
-        <w:t>MIN(</w:t>
-      </w:r>
-      <w:proofErr w:type="gramEnd"/>
-      <w:r>
-        <w:rPr>
-          <w:rFonts w:ascii="Times New Roman" w:hAnsi="Times New Roman" w:cs="Times New Roman"/>
-          <w:sz w:val="24"/>
-          <w:szCs w:val="24"/>
-        </w:rPr>
-        <w:t>B2:B103)-0.1</w:t>
+        <w:t>=MIN(B2:B103)-0.1</w:t>
       </w:r>
       <w:r>
         <w:rPr>
@@ -198,25 +180,7 @@
           <w:sz w:val="24"/>
           <w:szCs w:val="24"/>
         </w:rPr>
-        <w:t>=</w:t>
-      </w:r>
-      <w:proofErr w:type="gramStart"/>
-      <w:r>
-        <w:rPr>
-          <w:rFonts w:ascii="Times New Roman" w:hAnsi="Times New Roman" w:cs="Times New Roman"/>
-          <w:sz w:val="24"/>
-          <w:szCs w:val="24"/>
-        </w:rPr>
-        <w:t>MAX(</w:t>
-      </w:r>
-      <w:proofErr w:type="gramEnd"/>
-      <w:r>
-        <w:rPr>
-          <w:rFonts w:ascii="Times New Roman" w:hAnsi="Times New Roman" w:cs="Times New Roman"/>
-          <w:sz w:val="24"/>
-          <w:szCs w:val="24"/>
-        </w:rPr>
-        <w:t>B2:B103)+0.1</w:t>
+        <w:t>=MAX(B2:B103)+0.1</w:t>
       </w:r>
       <w:r>
         <w:rPr>
@@ -363,7 +327,7 @@
           <w:szCs w:val="24"/>
         </w:rPr>
         <w:drawing>
-          <wp:anchor distT="0" distB="0" distL="114300" distR="114300" simplePos="0" relativeHeight="251658240" behindDoc="0" locked="0" layoutInCell="1" allowOverlap="1" wp14:anchorId="13DBC905" wp14:editId="09714864">
+          <wp:anchor distT="0" distB="0" distL="114300" distR="114300" simplePos="0" relativeHeight="251658240" behindDoc="0" locked="0" layoutInCell="1" allowOverlap="1" wp14:anchorId="13DBC905" wp14:editId="1CDD76DB">
             <wp:simplePos x="0" y="0"/>
             <wp:positionH relativeFrom="column">
               <wp:posOffset>800100</wp:posOffset>
@@ -871,25 +835,7 @@
           <w:sz w:val="24"/>
           <w:szCs w:val="24"/>
         </w:rPr>
-        <w:t xml:space="preserve">Then drag (or </w:t>
-      </w:r>
-      <w:proofErr w:type="gramStart"/>
-      <w:r>
-        <w:rPr>
-          <w:rFonts w:ascii="Times New Roman" w:hAnsi="Times New Roman" w:cs="Times New Roman"/>
-          <w:sz w:val="24"/>
-          <w:szCs w:val="24"/>
-        </w:rPr>
-        <w:t>cut-paste</w:t>
-      </w:r>
-      <w:proofErr w:type="gramEnd"/>
-      <w:r>
-        <w:rPr>
-          <w:rFonts w:ascii="Times New Roman" w:hAnsi="Times New Roman" w:cs="Times New Roman"/>
-          <w:sz w:val="24"/>
-          <w:szCs w:val="24"/>
-        </w:rPr>
-        <w:t>)</w:t>
+        <w:t>Then drag (or cut-paste)</w:t>
       </w:r>
       <w:r>
         <w:rPr>
@@ -1001,43 +947,7 @@
           <w:sz w:val="24"/>
           <w:szCs w:val="24"/>
         </w:rPr>
-        <w:t xml:space="preserve">bin </w:t>
-      </w:r>
-      <w:proofErr w:type="gramStart"/>
-      <w:r>
-        <w:rPr>
-          <w:rFonts w:ascii="Times New Roman" w:hAnsi="Times New Roman" w:cs="Times New Roman"/>
-          <w:sz w:val="24"/>
-          <w:szCs w:val="24"/>
-        </w:rPr>
-        <w:t>has to</w:t>
-      </w:r>
-      <w:proofErr w:type="gramEnd"/>
-      <w:r>
-        <w:rPr>
-          <w:rFonts w:ascii="Times New Roman" w:hAnsi="Times New Roman" w:cs="Times New Roman"/>
-          <w:sz w:val="24"/>
-          <w:szCs w:val="24"/>
-        </w:rPr>
-        <w:t xml:space="preserve"> be the midpoint of the lower and upper limits. Enter the formula in F11 as </w:t>
-      </w:r>
-      <w:proofErr w:type="gramStart"/>
-      <w:r>
-        <w:rPr>
-          <w:rFonts w:ascii="Times New Roman" w:hAnsi="Times New Roman" w:cs="Times New Roman"/>
-          <w:sz w:val="24"/>
-          <w:szCs w:val="24"/>
-        </w:rPr>
-        <w:t>shown,  and</w:t>
-      </w:r>
-      <w:proofErr w:type="gramEnd"/>
-      <w:r>
-        <w:rPr>
-          <w:rFonts w:ascii="Times New Roman" w:hAnsi="Times New Roman" w:cs="Times New Roman"/>
-          <w:sz w:val="24"/>
-          <w:szCs w:val="24"/>
-        </w:rPr>
-        <w:t xml:space="preserve"> drag down the formula.</w:t>
+        <w:t>bin has to be the midpoint of the lower and upper limits. Enter the formula in F11 as shown,  and drag down the formula.</w:t>
       </w:r>
     </w:p>
     <w:p>
@@ -1069,9 +979,9 @@
           <w:szCs w:val="24"/>
         </w:rPr>
         <w:drawing>
-          <wp:inline distT="0" distB="0" distL="0" distR="0" wp14:anchorId="06DFE980" wp14:editId="3F7DBDA3">
-            <wp:extent cx="2142490" cy="2286000"/>
-            <wp:effectExtent l="0" t="0" r="0" b="0"/>
+          <wp:inline distT="0" distB="0" distL="0" distR="0" wp14:anchorId="06DFE980" wp14:editId="574B1AF6">
+            <wp:extent cx="2695968" cy="2876550"/>
+            <wp:effectExtent l="0" t="0" r="9525" b="0"/>
             <wp:docPr id="6" name="Picture 6" descr="A screenshot of a spreadsheet&#10;&#10;Description automatically generated"/>
             <wp:cNvGraphicFramePr>
               <a:graphicFrameLocks xmlns:a="http://schemas.openxmlformats.org/drawingml/2006/main" noChangeAspect="1"/>
@@ -1097,7 +1007,7 @@
                   <pic:spPr bwMode="auto">
                     <a:xfrm>
                       <a:off x="0" y="0"/>
-                      <a:ext cx="2146942" cy="2290750"/>
+                      <a:ext cx="2714183" cy="2895985"/>
                     </a:xfrm>
                     <a:prstGeom prst="rect">
                       <a:avLst/>
@@ -1121,6 +1031,17 @@
     <w:p>
       <w:pPr>
         <w:pStyle w:val="ListParagraph"/>
+        <w:jc w:val="center"/>
+        <w:rPr>
+          <w:rFonts w:ascii="Times New Roman" w:hAnsi="Times New Roman" w:cs="Times New Roman"/>
+          <w:sz w:val="24"/>
+          <w:szCs w:val="24"/>
+        </w:rPr>
+      </w:pPr>
+    </w:p>
+    <w:p>
+      <w:pPr>
+        <w:pStyle w:val="ListParagraph"/>
         <w:numPr>
           <w:ilvl w:val="0"/>
           <w:numId w:val="1"/>
@@ -1138,356 +1059,19 @@
           <w:sz w:val="24"/>
           <w:szCs w:val="24"/>
         </w:rPr>
-        <w:t>Now, you need to fill out the frequency column. You may use =</w:t>
-      </w:r>
-      <w:proofErr w:type="gramStart"/>
-      <w:r>
-        <w:rPr>
-          <w:rFonts w:ascii="Times New Roman" w:hAnsi="Times New Roman" w:cs="Times New Roman"/>
-          <w:sz w:val="24"/>
-          <w:szCs w:val="24"/>
-        </w:rPr>
-        <w:t>frequency(</w:t>
-      </w:r>
-      <w:proofErr w:type="gramEnd"/>
-      <w:r>
-        <w:rPr>
-          <w:rFonts w:ascii="Times New Roman" w:hAnsi="Times New Roman" w:cs="Times New Roman"/>
-          <w:sz w:val="24"/>
-          <w:szCs w:val="24"/>
-        </w:rPr>
-        <w:t xml:space="preserve">). But, </w:t>
-      </w:r>
-      <w:r>
-        <w:rPr>
-          <w:rFonts w:ascii="Times New Roman" w:hAnsi="Times New Roman" w:cs="Times New Roman"/>
-          <w:sz w:val="24"/>
-          <w:szCs w:val="24"/>
-        </w:rPr>
-        <w:t xml:space="preserve">here </w:t>
-      </w:r>
-      <w:r>
-        <w:rPr>
-          <w:rFonts w:ascii="Times New Roman" w:hAnsi="Times New Roman" w:cs="Times New Roman"/>
-          <w:sz w:val="24"/>
-          <w:szCs w:val="24"/>
-        </w:rPr>
-        <w:t>I show how to use =</w:t>
-      </w:r>
-      <w:proofErr w:type="spellStart"/>
-      <w:proofErr w:type="gramStart"/>
-      <w:r>
-        <w:rPr>
-          <w:rFonts w:ascii="Times New Roman" w:hAnsi="Times New Roman" w:cs="Times New Roman"/>
-          <w:sz w:val="24"/>
-          <w:szCs w:val="24"/>
-        </w:rPr>
-        <w:t>countifs</w:t>
-      </w:r>
-      <w:proofErr w:type="spellEnd"/>
-      <w:r>
-        <w:rPr>
-          <w:rFonts w:ascii="Times New Roman" w:hAnsi="Times New Roman" w:cs="Times New Roman"/>
-          <w:sz w:val="24"/>
-          <w:szCs w:val="24"/>
-        </w:rPr>
-        <w:t>(</w:t>
-      </w:r>
-      <w:proofErr w:type="gramEnd"/>
-      <w:r>
-        <w:rPr>
-          <w:rFonts w:ascii="Times New Roman" w:hAnsi="Times New Roman" w:cs="Times New Roman"/>
-          <w:sz w:val="24"/>
-          <w:szCs w:val="24"/>
-        </w:rPr>
-        <w:t>) to fill out the column. These sites explain how to use =</w:t>
-      </w:r>
-      <w:proofErr w:type="spellStart"/>
-      <w:proofErr w:type="gramStart"/>
-      <w:r>
-        <w:rPr>
-          <w:rFonts w:ascii="Times New Roman" w:hAnsi="Times New Roman" w:cs="Times New Roman"/>
-          <w:sz w:val="24"/>
-          <w:szCs w:val="24"/>
-        </w:rPr>
-        <w:t>countifs</w:t>
-      </w:r>
-      <w:proofErr w:type="spellEnd"/>
-      <w:r>
-        <w:rPr>
-          <w:rFonts w:ascii="Times New Roman" w:hAnsi="Times New Roman" w:cs="Times New Roman"/>
-          <w:sz w:val="24"/>
-          <w:szCs w:val="24"/>
-        </w:rPr>
-        <w:t>(</w:t>
-      </w:r>
-      <w:proofErr w:type="gramEnd"/>
-      <w:r>
-        <w:rPr>
-          <w:rFonts w:ascii="Times New Roman" w:hAnsi="Times New Roman" w:cs="Times New Roman"/>
-          <w:sz w:val="24"/>
-          <w:szCs w:val="24"/>
-        </w:rPr>
-        <w:t>).</w:t>
-      </w:r>
-      <w:r>
-        <w:rPr>
-          <w:rFonts w:ascii="Times New Roman" w:hAnsi="Times New Roman" w:cs="Times New Roman"/>
-          <w:sz w:val="24"/>
-          <w:szCs w:val="24"/>
-        </w:rPr>
-        <w:t xml:space="preserve"> The video linked in the spread sheet explains how to use =</w:t>
-      </w:r>
-      <w:proofErr w:type="gramStart"/>
-      <w:r>
-        <w:rPr>
-          <w:rFonts w:ascii="Times New Roman" w:hAnsi="Times New Roman" w:cs="Times New Roman"/>
-          <w:sz w:val="24"/>
-          <w:szCs w:val="24"/>
-        </w:rPr>
-        <w:t>FREQUENCY(</w:t>
-      </w:r>
-      <w:proofErr w:type="gramEnd"/>
-      <w:r>
-        <w:rPr>
-          <w:rFonts w:ascii="Times New Roman" w:hAnsi="Times New Roman" w:cs="Times New Roman"/>
-          <w:sz w:val="24"/>
-          <w:szCs w:val="24"/>
-        </w:rPr>
-        <w:t>) if you prefer.</w:t>
-      </w:r>
-    </w:p>
-    <w:p>
-      <w:pPr>
-        <w:pStyle w:val="ListParagraph"/>
-        <w:jc w:val="both"/>
-        <w:rPr>
-          <w:rFonts w:ascii="Times New Roman" w:hAnsi="Times New Roman" w:cs="Times New Roman"/>
-          <w:sz w:val="24"/>
-          <w:szCs w:val="24"/>
-        </w:rPr>
-      </w:pPr>
-    </w:p>
-    <w:p>
-      <w:pPr>
-        <w:pStyle w:val="ListParagraph"/>
-        <w:jc w:val="both"/>
-        <w:rPr>
-          <w:rFonts w:ascii="Times New Roman" w:hAnsi="Times New Roman" w:cs="Times New Roman"/>
-          <w:sz w:val="24"/>
-          <w:szCs w:val="24"/>
-        </w:rPr>
-      </w:pPr>
-      <w:hyperlink r:id="rId14" w:history="1">
-        <w:r>
-          <w:rPr>
-            <w:rStyle w:val="Hyperlink"/>
-            <w:rFonts w:ascii="Times New Roman" w:hAnsi="Times New Roman" w:cs="Times New Roman"/>
-            <w:sz w:val="24"/>
-            <w:szCs w:val="24"/>
-          </w:rPr>
-          <w:t>https://exceljet.net/excel-functions/excel-countifs-function</w:t>
-        </w:r>
-      </w:hyperlink>
-      <w:r>
-        <w:rPr>
-          <w:rFonts w:ascii="Times New Roman" w:hAnsi="Times New Roman" w:cs="Times New Roman"/>
-          <w:sz w:val="24"/>
-          <w:szCs w:val="24"/>
-        </w:rPr>
-        <w:t xml:space="preserve"> </w:t>
-      </w:r>
-    </w:p>
-    <w:p>
-      <w:pPr>
-        <w:pStyle w:val="ListParagraph"/>
-        <w:jc w:val="both"/>
-        <w:rPr>
-          <w:rFonts w:ascii="Times New Roman" w:hAnsi="Times New Roman" w:cs="Times New Roman"/>
-          <w:sz w:val="24"/>
-          <w:szCs w:val="24"/>
-        </w:rPr>
-      </w:pPr>
-    </w:p>
-    <w:p>
-      <w:pPr>
-        <w:pStyle w:val="ListParagraph"/>
-        <w:jc w:val="both"/>
-        <w:rPr>
-          <w:rFonts w:ascii="Times New Roman" w:hAnsi="Times New Roman" w:cs="Times New Roman"/>
-          <w:sz w:val="24"/>
-          <w:szCs w:val="24"/>
-        </w:rPr>
-      </w:pPr>
-      <w:hyperlink r:id="rId15" w:history="1">
-        <w:r>
-          <w:rPr>
-            <w:rStyle w:val="Hyperlink"/>
-            <w:rFonts w:ascii="Times New Roman" w:hAnsi="Times New Roman" w:cs="Times New Roman"/>
-            <w:sz w:val="24"/>
-            <w:szCs w:val="24"/>
-          </w:rPr>
-          <w:t>https://support.microsoft.com/en-us/office/countifs-function-dda3dc6e-f74e-4aee-88bc-aa8c2a866842</w:t>
-        </w:r>
-      </w:hyperlink>
-      <w:r>
-        <w:rPr>
-          <w:rFonts w:ascii="Times New Roman" w:hAnsi="Times New Roman" w:cs="Times New Roman"/>
-          <w:sz w:val="24"/>
-          <w:szCs w:val="24"/>
-        </w:rPr>
-        <w:t xml:space="preserve"> </w:t>
-      </w:r>
-    </w:p>
-    <w:p>
-      <w:pPr>
-        <w:pStyle w:val="ListParagraph"/>
-        <w:jc w:val="both"/>
-        <w:rPr>
-          <w:rFonts w:ascii="Times New Roman" w:hAnsi="Times New Roman" w:cs="Times New Roman"/>
-          <w:sz w:val="24"/>
-          <w:szCs w:val="24"/>
-        </w:rPr>
-      </w:pPr>
-    </w:p>
-    <w:p>
-      <w:pPr>
-        <w:pStyle w:val="ListParagraph"/>
-        <w:jc w:val="both"/>
-      </w:pPr>
-      <w:r>
-        <w:t>There is a video link in the DQ that is made specifically for this class. (I won’t put the link here as it might change.)</w:t>
-      </w:r>
-    </w:p>
-    <w:p>
-      <w:pPr>
-        <w:pStyle w:val="ListParagraph"/>
-        <w:jc w:val="both"/>
-        <w:rPr>
-          <w:rFonts w:ascii="Times New Roman" w:hAnsi="Times New Roman" w:cs="Times New Roman"/>
-          <w:sz w:val="24"/>
-          <w:szCs w:val="24"/>
-        </w:rPr>
-      </w:pPr>
-    </w:p>
-    <w:p>
-      <w:pPr>
-        <w:pStyle w:val="ListParagraph"/>
-        <w:jc w:val="center"/>
-        <w:rPr>
-          <w:rFonts w:ascii="Times New Roman" w:hAnsi="Times New Roman" w:cs="Times New Roman"/>
-          <w:sz w:val="24"/>
-          <w:szCs w:val="24"/>
-        </w:rPr>
-      </w:pPr>
-    </w:p>
-    <w:p>
-      <w:pPr>
-        <w:jc w:val="both"/>
-        <w:rPr>
-          <w:rFonts w:ascii="Times New Roman" w:hAnsi="Times New Roman" w:cs="Times New Roman"/>
-          <w:sz w:val="24"/>
-          <w:szCs w:val="24"/>
-        </w:rPr>
-      </w:pPr>
-    </w:p>
-    <w:p>
-      <w:pPr>
-        <w:jc w:val="both"/>
-        <w:rPr>
-          <w:rFonts w:ascii="Times New Roman" w:hAnsi="Times New Roman" w:cs="Times New Roman"/>
-          <w:sz w:val="24"/>
-          <w:szCs w:val="24"/>
-        </w:rPr>
-      </w:pPr>
-    </w:p>
-    <w:p>
-      <w:pPr>
-        <w:jc w:val="both"/>
-        <w:rPr>
-          <w:rFonts w:ascii="Times New Roman" w:hAnsi="Times New Roman" w:cs="Times New Roman"/>
-          <w:sz w:val="24"/>
-          <w:szCs w:val="24"/>
-        </w:rPr>
-      </w:pPr>
-    </w:p>
-    <w:p>
-      <w:pPr>
-        <w:jc w:val="both"/>
-        <w:rPr>
-          <w:rFonts w:ascii="Times New Roman" w:hAnsi="Times New Roman" w:cs="Times New Roman"/>
-          <w:sz w:val="24"/>
-          <w:szCs w:val="24"/>
-        </w:rPr>
-      </w:pPr>
-    </w:p>
-    <w:p>
-      <w:pPr>
-        <w:jc w:val="both"/>
-        <w:rPr>
-          <w:rFonts w:ascii="Times New Roman" w:hAnsi="Times New Roman" w:cs="Times New Roman"/>
-          <w:sz w:val="24"/>
-          <w:szCs w:val="24"/>
-        </w:rPr>
-      </w:pPr>
-    </w:p>
-    <w:p>
-      <w:pPr>
-        <w:jc w:val="both"/>
-        <w:rPr>
-          <w:rFonts w:ascii="Times New Roman" w:hAnsi="Times New Roman" w:cs="Times New Roman"/>
-          <w:sz w:val="24"/>
-          <w:szCs w:val="24"/>
-        </w:rPr>
-      </w:pPr>
-    </w:p>
-    <w:p>
-      <w:pPr>
-        <w:jc w:val="both"/>
-        <w:rPr>
-          <w:rFonts w:ascii="Times New Roman" w:hAnsi="Times New Roman" w:cs="Times New Roman"/>
-          <w:sz w:val="24"/>
-          <w:szCs w:val="24"/>
-        </w:rPr>
-      </w:pPr>
-    </w:p>
-    <w:p>
-      <w:pPr>
-        <w:jc w:val="both"/>
-        <w:rPr>
-          <w:rFonts w:ascii="Times New Roman" w:hAnsi="Times New Roman" w:cs="Times New Roman"/>
-          <w:sz w:val="24"/>
-          <w:szCs w:val="24"/>
-        </w:rPr>
-      </w:pPr>
-      <w:r>
-        <w:rPr>
-          <w:rFonts w:ascii="Times New Roman" w:hAnsi="Times New Roman" w:cs="Times New Roman"/>
-          <w:noProof/>
-          <w:sz w:val="24"/>
-          <w:szCs w:val="24"/>
-        </w:rPr>
         <w:drawing>
-          <wp:anchor distT="0" distB="0" distL="114300" distR="114300" simplePos="0" relativeHeight="251660288" behindDoc="1" locked="0" layoutInCell="1" allowOverlap="1" wp14:anchorId="50A80D54" wp14:editId="5C1BE1FA">
+          <wp:anchor distT="0" distB="0" distL="114300" distR="114300" simplePos="0" relativeHeight="251663360" behindDoc="0" locked="0" layoutInCell="1" allowOverlap="1" wp14:anchorId="468F810B" wp14:editId="5D7AF242">
             <wp:simplePos x="0" y="0"/>
-            <wp:positionH relativeFrom="column">
-              <wp:posOffset>1341120</wp:posOffset>
+            <wp:positionH relativeFrom="page">
+              <wp:posOffset>1715135</wp:posOffset>
             </wp:positionH>
-            <wp:positionV relativeFrom="line">
-              <wp:posOffset>-2444115</wp:posOffset>
+            <wp:positionV relativeFrom="paragraph">
+              <wp:posOffset>542925</wp:posOffset>
             </wp:positionV>
-            <wp:extent cx="3721608" cy="3020509"/>
+            <wp:extent cx="4790440" cy="3324860"/>
             <wp:effectExtent l="0" t="0" r="0" b="8890"/>
-            <wp:wrapTight wrapText="bothSides">
-              <wp:wrapPolygon edited="0">
-                <wp:start x="0" y="0"/>
-                <wp:lineTo x="0" y="21527"/>
-                <wp:lineTo x="21453" y="21527"/>
-                <wp:lineTo x="21453" y="0"/>
-                <wp:lineTo x="0" y="0"/>
-              </wp:wrapPolygon>
-            </wp:wrapTight>
-            <wp:docPr id="13" name="Picture 13"/>
+            <wp:wrapTopAndBottom/>
+            <wp:docPr id="607853310" name="Picture 1"/>
             <wp:cNvGraphicFramePr>
               <a:graphicFrameLocks xmlns:a="http://schemas.openxmlformats.org/drawingml/2006/main" noChangeAspect="1"/>
             </wp:cNvGraphicFramePr>
@@ -1495,202 +1079,11 @@
               <a:graphicData uri="http://schemas.openxmlformats.org/drawingml/2006/picture">
                 <pic:pic xmlns:pic="http://schemas.openxmlformats.org/drawingml/2006/picture">
                   <pic:nvPicPr>
-                    <pic:cNvPr id="1" name=""/>
-                    <pic:cNvPicPr/>
-                  </pic:nvPicPr>
-                  <pic:blipFill rotWithShape="1">
-                    <a:blip r:embed="rId16">
-                      <a:extLst>
-                        <a:ext uri="{28A0092B-C50C-407E-A947-70E740481C1C}">
-                          <a14:useLocalDpi xmlns:a14="http://schemas.microsoft.com/office/drawing/2010/main" val="0"/>
-                        </a:ext>
-                      </a:extLst>
-                    </a:blip>
-                    <a:srcRect b="12884"/>
-                    <a:stretch/>
-                  </pic:blipFill>
-                  <pic:spPr bwMode="auto">
-                    <a:xfrm>
-                      <a:off x="0" y="0"/>
-                      <a:ext cx="3721608" cy="3020509"/>
-                    </a:xfrm>
-                    <a:prstGeom prst="rect">
-                      <a:avLst/>
-                    </a:prstGeom>
-                    <a:ln>
-                      <a:noFill/>
-                    </a:ln>
-                    <a:extLst>
-                      <a:ext uri="{53640926-AAD7-44D8-BBD7-CCE9431645EC}">
-                        <a14:shadowObscured xmlns:a14="http://schemas.microsoft.com/office/drawing/2010/main"/>
-                      </a:ext>
-                    </a:extLst>
-                  </pic:spPr>
-                </pic:pic>
-              </a:graphicData>
-            </a:graphic>
-            <wp14:sizeRelH relativeFrom="margin">
-              <wp14:pctWidth>0</wp14:pctWidth>
-            </wp14:sizeRelH>
-          </wp:anchor>
-        </w:drawing>
-      </w:r>
-    </w:p>
-    <w:p>
-      <w:pPr>
-        <w:jc w:val="both"/>
-        <w:rPr>
-          <w:rFonts w:ascii="Times New Roman" w:hAnsi="Times New Roman" w:cs="Times New Roman"/>
-          <w:sz w:val="24"/>
-          <w:szCs w:val="24"/>
-        </w:rPr>
-      </w:pPr>
-    </w:p>
-    <w:p>
-      <w:pPr>
-        <w:pStyle w:val="ListParagraph"/>
-        <w:numPr>
-          <w:ilvl w:val="0"/>
-          <w:numId w:val="1"/>
-        </w:numPr>
-        <w:jc w:val="both"/>
-        <w:rPr>
-          <w:rFonts w:ascii="Times New Roman" w:hAnsi="Times New Roman" w:cs="Times New Roman"/>
-          <w:sz w:val="24"/>
-          <w:szCs w:val="24"/>
-        </w:rPr>
-      </w:pPr>
-      <w:r>
-        <w:rPr>
-          <w:rFonts w:ascii="Times New Roman" w:hAnsi="Times New Roman" w:cs="Times New Roman"/>
-          <w:sz w:val="24"/>
-          <w:szCs w:val="24"/>
-        </w:rPr>
-        <w:lastRenderedPageBreak/>
-        <w:t xml:space="preserve">The relative frequency is =frequency / 102. There are 102 wells. </w:t>
-      </w:r>
-      <w:r>
-        <w:rPr>
-          <w:rFonts w:ascii="Times New Roman" w:hAnsi="Times New Roman" w:cs="Times New Roman"/>
-          <w:sz w:val="24"/>
-          <w:szCs w:val="24"/>
-        </w:rPr>
-        <w:t>Even better is =</w:t>
-      </w:r>
-      <w:r>
-        <w:rPr>
-          <w:rFonts w:ascii="Times New Roman" w:hAnsi="Times New Roman" w:cs="Times New Roman"/>
-          <w:sz w:val="24"/>
-          <w:szCs w:val="24"/>
-        </w:rPr>
-        <w:t>G11/COUNT(</w:t>
-      </w:r>
-      <w:proofErr w:type="spellStart"/>
-      <w:r>
-        <w:rPr>
-          <w:rFonts w:ascii="Times New Roman" w:hAnsi="Times New Roman" w:cs="Times New Roman"/>
-          <w:sz w:val="24"/>
-          <w:szCs w:val="24"/>
-        </w:rPr>
-        <w:t>Difference_in_water_quality</w:t>
-      </w:r>
-      <w:proofErr w:type="spellEnd"/>
-      <w:r>
-        <w:rPr>
-          <w:rFonts w:ascii="Times New Roman" w:hAnsi="Times New Roman" w:cs="Times New Roman"/>
-          <w:sz w:val="24"/>
-          <w:szCs w:val="24"/>
-        </w:rPr>
-        <w:t>)</w:t>
-      </w:r>
-      <w:r>
-        <w:rPr>
-          <w:rFonts w:ascii="Times New Roman" w:hAnsi="Times New Roman" w:cs="Times New Roman"/>
-          <w:sz w:val="24"/>
-          <w:szCs w:val="24"/>
-        </w:rPr>
-        <w:t xml:space="preserve"> for H11, and even better is range operation </w:t>
-      </w:r>
-      <w:r>
-        <w:rPr>
-          <w:rFonts w:ascii="Times New Roman" w:hAnsi="Times New Roman" w:cs="Times New Roman"/>
-          <w:sz w:val="24"/>
-          <w:szCs w:val="24"/>
-        </w:rPr>
-        <w:t>=G11#/COUNT(</w:t>
-      </w:r>
-      <w:proofErr w:type="spellStart"/>
-      <w:r>
-        <w:rPr>
-          <w:rFonts w:ascii="Times New Roman" w:hAnsi="Times New Roman" w:cs="Times New Roman"/>
-          <w:sz w:val="24"/>
-          <w:szCs w:val="24"/>
-        </w:rPr>
-        <w:t>Difference_in_water_quality</w:t>
-      </w:r>
-      <w:proofErr w:type="spellEnd"/>
-      <w:r>
-        <w:rPr>
-          <w:rFonts w:ascii="Times New Roman" w:hAnsi="Times New Roman" w:cs="Times New Roman"/>
-          <w:sz w:val="24"/>
-          <w:szCs w:val="24"/>
-        </w:rPr>
-        <w:t>)</w:t>
-      </w:r>
-      <w:r>
-        <w:rPr>
-          <w:rFonts w:ascii="Times New Roman" w:hAnsi="Times New Roman" w:cs="Times New Roman"/>
-          <w:sz w:val="24"/>
-          <w:szCs w:val="24"/>
-        </w:rPr>
-        <w:t xml:space="preserve"> which fills out the entire “Relative Frequency” column.</w:t>
-      </w:r>
-    </w:p>
-    <w:p>
-      <w:pPr>
-        <w:pStyle w:val="ListParagraph"/>
-        <w:jc w:val="both"/>
-        <w:rPr>
-          <w:rFonts w:ascii="Times New Roman" w:hAnsi="Times New Roman" w:cs="Times New Roman"/>
-          <w:sz w:val="24"/>
-          <w:szCs w:val="24"/>
-        </w:rPr>
-      </w:pPr>
-    </w:p>
-    <w:p>
-      <w:pPr>
-        <w:pStyle w:val="ListParagraph"/>
-        <w:jc w:val="center"/>
-        <w:rPr>
-          <w:rFonts w:ascii="Times New Roman" w:hAnsi="Times New Roman" w:cs="Times New Roman"/>
-          <w:sz w:val="24"/>
-          <w:szCs w:val="24"/>
-        </w:rPr>
-      </w:pPr>
-      <w:r>
-        <w:rPr>
-          <w:rFonts w:ascii="Times New Roman" w:hAnsi="Times New Roman" w:cs="Times New Roman"/>
-          <w:noProof/>
-          <w:sz w:val="24"/>
-          <w:szCs w:val="24"/>
-        </w:rPr>
-        <w:drawing>
-          <wp:inline distT="0" distB="0" distL="0" distR="0" wp14:anchorId="102B4D0C" wp14:editId="77BA6AD7">
-            <wp:extent cx="4724400" cy="2973006"/>
-            <wp:effectExtent l="0" t="0" r="0" b="0"/>
-            <wp:docPr id="7" name="Picture 7"/>
-            <wp:cNvGraphicFramePr>
-              <a:graphicFrameLocks xmlns:a="http://schemas.openxmlformats.org/drawingml/2006/main" noChangeAspect="1"/>
-            </wp:cNvGraphicFramePr>
-            <a:graphic xmlns:a="http://schemas.openxmlformats.org/drawingml/2006/main">
-              <a:graphicData uri="http://schemas.openxmlformats.org/drawingml/2006/picture">
-                <pic:pic xmlns:pic="http://schemas.openxmlformats.org/drawingml/2006/picture">
-                  <pic:nvPicPr>
-                    <pic:cNvPr id="1" name=""/>
+                    <pic:cNvPr id="607853310" name=""/>
                     <pic:cNvPicPr/>
                   </pic:nvPicPr>
                   <pic:blipFill>
-                    <a:blip r:embed="rId17"/>
+                    <a:blip r:embed="rId14"/>
                     <a:stretch>
                       <a:fillRect/>
                     </a:stretch>
@@ -1698,7 +1091,7 @@
                   <pic:spPr>
                     <a:xfrm>
                       <a:off x="0" y="0"/>
-                      <a:ext cx="4732531" cy="2978123"/>
+                      <a:ext cx="4790440" cy="3324860"/>
                     </a:xfrm>
                     <a:prstGeom prst="rect">
                       <a:avLst/>
@@ -1707,7 +1100,194 @@
                 </pic:pic>
               </a:graphicData>
             </a:graphic>
-          </wp:inline>
+            <wp14:sizeRelH relativeFrom="margin">
+              <wp14:pctWidth>0</wp14:pctWidth>
+            </wp14:sizeRelH>
+            <wp14:sizeRelV relativeFrom="margin">
+              <wp14:pctHeight>0</wp14:pctHeight>
+            </wp14:sizeRelV>
+          </wp:anchor>
+        </w:drawing>
+      </w:r>
+      <w:r>
+        <w:rPr>
+          <w:rFonts w:ascii="Times New Roman" w:hAnsi="Times New Roman" w:cs="Times New Roman"/>
+          <w:sz w:val="24"/>
+          <w:szCs w:val="24"/>
+        </w:rPr>
+        <w:t xml:space="preserve">Now, you need to fill out the frequency column. </w:t>
+      </w:r>
+      <w:r>
+        <w:rPr>
+          <w:rFonts w:ascii="Times New Roman" w:hAnsi="Times New Roman" w:cs="Times New Roman"/>
+          <w:sz w:val="24"/>
+          <w:szCs w:val="24"/>
+        </w:rPr>
+        <w:t xml:space="preserve">The simplest thing to use here is the =FREQUENCY() function. In this case, =FREQUENCY(B:B, E11:E19) is what you want. </w:t>
+      </w:r>
+    </w:p>
+    <w:p>
+      <w:pPr>
+        <w:pStyle w:val="ListParagraph"/>
+        <w:jc w:val="both"/>
+        <w:rPr>
+          <w:rFonts w:ascii="Times New Roman" w:hAnsi="Times New Roman" w:cs="Times New Roman"/>
+          <w:sz w:val="24"/>
+          <w:szCs w:val="24"/>
+        </w:rPr>
+      </w:pPr>
+    </w:p>
+    <w:p>
+      <w:pPr>
+        <w:pStyle w:val="ListParagraph"/>
+        <w:jc w:val="both"/>
+        <w:rPr>
+          <w:rFonts w:ascii="Times New Roman" w:hAnsi="Times New Roman" w:cs="Times New Roman"/>
+          <w:sz w:val="24"/>
+          <w:szCs w:val="24"/>
+        </w:rPr>
+      </w:pPr>
+      <w:r>
+        <w:t>There is a video link in the DQ that is made specifically for this class. (I won’t put the link here as it might change.)</w:t>
+      </w:r>
+      <w:r>
+        <w:rPr>
+          <w:rFonts w:ascii="Times New Roman" w:hAnsi="Times New Roman" w:cs="Times New Roman"/>
+          <w:sz w:val="24"/>
+          <w:szCs w:val="24"/>
+        </w:rPr>
+        <w:t>The relative frequency is =</w:t>
+      </w:r>
+      <w:r>
+        <w:rPr>
+          <w:rFonts w:ascii="Times New Roman" w:hAnsi="Times New Roman" w:cs="Times New Roman"/>
+          <w:sz w:val="24"/>
+          <w:szCs w:val="24"/>
+        </w:rPr>
+        <w:t xml:space="preserve"> </w:t>
+      </w:r>
+      <w:r>
+        <w:rPr>
+          <w:rFonts w:ascii="Times New Roman" w:hAnsi="Times New Roman" w:cs="Times New Roman"/>
+          <w:sz w:val="24"/>
+          <w:szCs w:val="24"/>
+        </w:rPr>
+        <w:t>frequency/</w:t>
+      </w:r>
+      <w:r>
+        <w:rPr>
+          <w:rFonts w:ascii="Times New Roman" w:hAnsi="Times New Roman" w:cs="Times New Roman"/>
+          <w:sz w:val="24"/>
+          <w:szCs w:val="24"/>
+        </w:rPr>
+        <w:t>(number of data points)</w:t>
+      </w:r>
+      <w:r>
+        <w:rPr>
+          <w:rFonts w:ascii="Times New Roman" w:hAnsi="Times New Roman" w:cs="Times New Roman"/>
+          <w:sz w:val="24"/>
+          <w:szCs w:val="24"/>
+        </w:rPr>
+        <w:t xml:space="preserve">. There are </w:t>
+      </w:r>
+      <w:r>
+        <w:rPr>
+          <w:rFonts w:ascii="Times New Roman" w:hAnsi="Times New Roman" w:cs="Times New Roman"/>
+          <w:sz w:val="24"/>
+          <w:szCs w:val="24"/>
+        </w:rPr>
+        <w:lastRenderedPageBreak/>
+        <w:t>102 wells</w:t>
+      </w:r>
+      <w:r>
+        <w:rPr>
+          <w:rFonts w:ascii="Times New Roman" w:hAnsi="Times New Roman" w:cs="Times New Roman"/>
+          <w:sz w:val="24"/>
+          <w:szCs w:val="24"/>
+        </w:rPr>
+        <w:t>, i.e., data points</w:t>
+      </w:r>
+      <w:r>
+        <w:rPr>
+          <w:rFonts w:ascii="Times New Roman" w:hAnsi="Times New Roman" w:cs="Times New Roman"/>
+          <w:sz w:val="24"/>
+          <w:szCs w:val="24"/>
+        </w:rPr>
+        <w:t xml:space="preserve">. </w:t>
+      </w:r>
+      <w:r>
+        <w:rPr>
+          <w:rFonts w:ascii="Times New Roman" w:hAnsi="Times New Roman" w:cs="Times New Roman"/>
+          <w:sz w:val="24"/>
+          <w:szCs w:val="24"/>
+        </w:rPr>
+        <w:t>This formula works in H11: =G11/SUM(G$11:G$20) and then use autofill. Depending on how you computed the frequency you might be able to use =G11#/SUM(G11#) in H11 and this will fill out the entire column.</w:t>
+      </w:r>
+    </w:p>
+    <w:p>
+      <w:pPr>
+        <w:pStyle w:val="ListParagraph"/>
+        <w:jc w:val="center"/>
+        <w:rPr>
+          <w:rFonts w:ascii="Times New Roman" w:hAnsi="Times New Roman" w:cs="Times New Roman"/>
+          <w:sz w:val="24"/>
+          <w:szCs w:val="24"/>
+        </w:rPr>
+      </w:pPr>
+      <w:r>
+        <w:rPr>
+          <w:rFonts w:ascii="Times New Roman" w:hAnsi="Times New Roman" w:cs="Times New Roman"/>
+          <w:sz w:val="24"/>
+          <w:szCs w:val="24"/>
+        </w:rPr>
+        <w:drawing>
+          <wp:anchor distT="0" distB="0" distL="114300" distR="114300" simplePos="0" relativeHeight="251665408" behindDoc="0" locked="0" layoutInCell="1" allowOverlap="1" wp14:anchorId="114FCC9C" wp14:editId="1CA6B62D">
+            <wp:simplePos x="0" y="0"/>
+            <wp:positionH relativeFrom="column">
+              <wp:posOffset>724535</wp:posOffset>
+            </wp:positionH>
+            <wp:positionV relativeFrom="paragraph">
+              <wp:posOffset>213360</wp:posOffset>
+            </wp:positionV>
+            <wp:extent cx="4624070" cy="3141345"/>
+            <wp:effectExtent l="0" t="0" r="5080" b="1905"/>
+            <wp:wrapTopAndBottom/>
+            <wp:docPr id="1417006746" name="Picture 1"/>
+            <wp:cNvGraphicFramePr>
+              <a:graphicFrameLocks xmlns:a="http://schemas.openxmlformats.org/drawingml/2006/main" noChangeAspect="1"/>
+            </wp:cNvGraphicFramePr>
+            <a:graphic xmlns:a="http://schemas.openxmlformats.org/drawingml/2006/main">
+              <a:graphicData uri="http://schemas.openxmlformats.org/drawingml/2006/picture">
+                <pic:pic xmlns:pic="http://schemas.openxmlformats.org/drawingml/2006/picture">
+                  <pic:nvPicPr>
+                    <pic:cNvPr id="1417006746" name=""/>
+                    <pic:cNvPicPr/>
+                  </pic:nvPicPr>
+                  <pic:blipFill>
+                    <a:blip r:embed="rId15"/>
+                    <a:stretch>
+                      <a:fillRect/>
+                    </a:stretch>
+                  </pic:blipFill>
+                  <pic:spPr>
+                    <a:xfrm>
+                      <a:off x="0" y="0"/>
+                      <a:ext cx="4624070" cy="3141345"/>
+                    </a:xfrm>
+                    <a:prstGeom prst="rect">
+                      <a:avLst/>
+                    </a:prstGeom>
+                  </pic:spPr>
+                </pic:pic>
+              </a:graphicData>
+            </a:graphic>
+            <wp14:sizeRelH relativeFrom="margin">
+              <wp14:pctWidth>0</wp14:pctWidth>
+            </wp14:sizeRelH>
+            <wp14:sizeRelV relativeFrom="margin">
+              <wp14:pctHeight>0</wp14:pctHeight>
+            </wp14:sizeRelV>
+          </wp:anchor>
         </w:drawing>
       </w:r>
     </w:p>
@@ -1880,7 +1460,7 @@
                     <pic:cNvPicPr/>
                   </pic:nvPicPr>
                   <pic:blipFill>
-                    <a:blip r:embed="rId18">
+                    <a:blip r:embed="rId16">
                       <a:extLst>
                         <a:ext uri="{28A0092B-C50C-407E-A947-70E740481C1C}">
                           <a14:useLocalDpi xmlns:a14="http://schemas.microsoft.com/office/drawing/2010/main" val="0"/>
@@ -2043,7 +1623,7 @@
                     <pic:cNvPicPr/>
                   </pic:nvPicPr>
                   <pic:blipFill>
-                    <a:blip r:embed="rId19"/>
+                    <a:blip r:embed="rId17"/>
                     <a:stretch>
                       <a:fillRect/>
                     </a:stretch>
@@ -2146,7 +1726,7 @@
 </file>
 
 <file path=word/numbering.xml><?xml version="1.0" encoding="utf-8"?>
-<w:numbering xmlns:wpc="http://schemas.microsoft.com/office/word/2010/wordprocessingCanvas" xmlns:cx="http://schemas.microsoft.com/office/drawing/2014/chartex" xmlns:cx1="http://schemas.microsoft.com/office/drawing/2015/9/8/chartex" xmlns:cx2="http://schemas.microsoft.com/office/drawing/2015/10/21/chartex" xmlns:cx3="http://schemas.microsoft.com/office/drawing/2016/5/9/chartex" xmlns:cx4="http://schemas.microsoft.com/office/drawing/2016/5/10/chartex" xmlns:cx5="http://schemas.microsoft.com/office/drawing/2016/5/11/chartex" xmlns:cx6="http://schemas.microsoft.com/office/drawing/2016/5/12/chartex" xmlns:cx7="http://schemas.microsoft.com/office/drawing/2016/5/13/chartex" xmlns:cx8="http://schemas.microsoft.com/office/drawing/2016/5/14/chartex" xmlns:mc="http://schemas.openxmlformats.org/markup-compatibility/2006" xmlns:aink="http://schemas.microsoft.com/office/drawing/2016/ink" xmlns:am3d="http://schemas.microsoft.com/office/drawing/2017/model3d" xmlns:o="urn:schemas-microsoft-com:office:office" xmlns:oel="http://schemas.microsoft.com/office/2019/extlst" xmlns:r="http://schemas.openxmlformats.org/officeDocument/2006/relationships" xmlns:m="http://schemas.openxmlformats.org/officeDocument/2006/math" xmlns:v="urn:schemas-microsoft-com:vml" xmlns:wp14="http://schemas.microsoft.com/office/word/2010/wordprocessingDrawing" xmlns:wp="http://schemas.openxmlformats.org/drawingml/2006/wordprocessingDrawing" xmlns:w10="urn:schemas-microsoft-com:office:word" xmlns:w="http://schemas.openxmlformats.org/wordprocessingml/2006/main" xmlns:w14="http://schemas.microsoft.com/office/word/2010/wordml" xmlns:w15="http://schemas.microsoft.com/office/word/2012/wordml" xmlns:w16cex="http://schemas.microsoft.com/office/word/2018/wordml/cex" xmlns:w16cid="http://schemas.microsoft.com/office/word/2016/wordml/cid" xmlns:w16="http://schemas.microsoft.com/office/word/2018/wordml" xmlns:w16sdtdh="http://schemas.microsoft.com/office/word/2020/wordml/sdtdatahash" xmlns:w16se="http://schemas.microsoft.com/office/word/2015/wordml/symex" xmlns:wpg="http://schemas.microsoft.com/office/word/2010/wordprocessingGroup" xmlns:wpi="http://schemas.microsoft.com/office/word/2010/wordprocessingInk" xmlns:wne="http://schemas.microsoft.com/office/word/2006/wordml" xmlns:wps="http://schemas.microsoft.com/office/word/2010/wordprocessingShape" mc:Ignorable="w14 w15 w16se w16cid w16 w16cex w16sdtdh wp14">
+<w:numbering xmlns:wpc="http://schemas.microsoft.com/office/word/2010/wordprocessingCanvas" xmlns:cx="http://schemas.microsoft.com/office/drawing/2014/chartex" xmlns:cx1="http://schemas.microsoft.com/office/drawing/2015/9/8/chartex" xmlns:cx2="http://schemas.microsoft.com/office/drawing/2015/10/21/chartex" xmlns:cx3="http://schemas.microsoft.com/office/drawing/2016/5/9/chartex" xmlns:cx4="http://schemas.microsoft.com/office/drawing/2016/5/10/chartex" xmlns:cx5="http://schemas.microsoft.com/office/drawing/2016/5/11/chartex" xmlns:cx6="http://schemas.microsoft.com/office/drawing/2016/5/12/chartex" xmlns:cx7="http://schemas.microsoft.com/office/drawing/2016/5/13/chartex" xmlns:cx8="http://schemas.microsoft.com/office/drawing/2016/5/14/chartex" xmlns:mc="http://schemas.openxmlformats.org/markup-compatibility/2006" xmlns:aink="http://schemas.microsoft.com/office/drawing/2016/ink" xmlns:am3d="http://schemas.microsoft.com/office/drawing/2017/model3d" xmlns:o="urn:schemas-microsoft-com:office:office" xmlns:oel="http://schemas.microsoft.com/office/2019/extlst" xmlns:r="http://schemas.openxmlformats.org/officeDocument/2006/relationships" xmlns:m="http://schemas.openxmlformats.org/officeDocument/2006/math" xmlns:v="urn:schemas-microsoft-com:vml" xmlns:wp14="http://schemas.microsoft.com/office/word/2010/wordprocessingDrawing" xmlns:wp="http://schemas.openxmlformats.org/drawingml/2006/wordprocessingDrawing" xmlns:w10="urn:schemas-microsoft-com:office:word" xmlns:w="http://schemas.openxmlformats.org/wordprocessingml/2006/main" xmlns:w14="http://schemas.microsoft.com/office/word/2010/wordml" xmlns:w15="http://schemas.microsoft.com/office/word/2012/wordml" xmlns:w16cei="http://schemas.microsoft.com/office/word/2026/wordml/cei" xmlns:w16cex="http://schemas.microsoft.com/office/word/2018/wordml/cex" xmlns:w16cid="http://schemas.microsoft.com/office/word/2016/wordml/cid" xmlns:w16="http://schemas.microsoft.com/office/word/2018/wordml" xmlns:w16du="http://schemas.microsoft.com/office/word/2023/wordml/word16du" xmlns:w16sdtdh="http://schemas.microsoft.com/office/word/2020/wordml/sdtdatahash" xmlns:w16sdtfl="http://schemas.microsoft.com/office/word/2024/wordml/sdtformatlock" xmlns:w16se="http://schemas.microsoft.com/office/word/2015/wordml/symex" xmlns:wpg="http://schemas.microsoft.com/office/word/2010/wordprocessingGroup" xmlns:wpi="http://schemas.microsoft.com/office/word/2010/wordprocessingInk" xmlns:wne="http://schemas.microsoft.com/office/word/2006/wordml" xmlns:wps="http://schemas.microsoft.com/office/word/2010/wordprocessingShape" mc:Ignorable="w14 w15 w16se w16cid w16 w16cex w16sdtdh w16sdtfl w16du wp14">
   <w:abstractNum w:abstractNumId="0" w15:restartNumberingAfterBreak="0">
     <w:nsid w:val="6C971DB1"/>
     <w:multiLevelType w:val="hybridMultilevel"/>
@@ -2240,7 +1820,7 @@
 </file>
 
 <file path=word/styles.xml><?xml version="1.0" encoding="utf-8"?>
-<w:styles xmlns:mc="http://schemas.openxmlformats.org/markup-compatibility/2006" xmlns:r="http://schemas.openxmlformats.org/officeDocument/2006/relationships" xmlns:w="http://schemas.openxmlformats.org/wordprocessingml/2006/main" xmlns:w14="http://schemas.microsoft.com/office/word/2010/wordml" xmlns:w15="http://schemas.microsoft.com/office/word/2012/wordml" xmlns:w16cex="http://schemas.microsoft.com/office/word/2018/wordml/cex" xmlns:w16cid="http://schemas.microsoft.com/office/word/2016/wordml/cid" xmlns:w16="http://schemas.microsoft.com/office/word/2018/wordml" xmlns:w16sdtdh="http://schemas.microsoft.com/office/word/2020/wordml/sdtdatahash" xmlns:w16se="http://schemas.microsoft.com/office/word/2015/wordml/symex" mc:Ignorable="w14 w15 w16se w16cid w16 w16cex w16sdtdh">
+<w:styles xmlns:mc="http://schemas.openxmlformats.org/markup-compatibility/2006" xmlns:r="http://schemas.openxmlformats.org/officeDocument/2006/relationships" xmlns:w="http://schemas.openxmlformats.org/wordprocessingml/2006/main" xmlns:w14="http://schemas.microsoft.com/office/word/2010/wordml" xmlns:w15="http://schemas.microsoft.com/office/word/2012/wordml" xmlns:w16cex="http://schemas.microsoft.com/office/word/2018/wordml/cex" xmlns:w16cid="http://schemas.microsoft.com/office/word/2016/wordml/cid" xmlns:w16="http://schemas.microsoft.com/office/word/2018/wordml" xmlns:w16du="http://schemas.microsoft.com/office/word/2023/wordml/word16du" xmlns:w16sdtdh="http://schemas.microsoft.com/office/word/2020/wordml/sdtdatahash" xmlns:w16sdtfl="http://schemas.microsoft.com/office/word/2024/wordml/sdtformatlock" xmlns:w16se="http://schemas.microsoft.com/office/word/2015/wordml/symex" mc:Ignorable="w14 w15 w16se w16cid w16 w16cex w16sdtdh w16sdtfl w16du">
   <w:docDefaults>
     <w:rPrDefault>
       <w:rPr>
@@ -3010,17 +2590,18 @@
 </file>
 
 <file path=customXml/item1.xml><?xml version="1.0" encoding="utf-8"?>
-<?mso-contentType ?>
-<FormTemplates xmlns="http://schemas.microsoft.com/sharepoint/v3/contenttype/forms">
-  <Display>DocumentLibraryForm</Display>
-  <Edit>DocumentLibraryForm</Edit>
-  <New>DocumentLibraryForm</New>
-</FormTemplates>
+<p:properties xmlns:p="http://schemas.microsoft.com/office/2006/metadata/properties" xmlns:xsi="http://www.w3.org/2001/XMLSchema-instance" xmlns:pc="http://schemas.microsoft.com/office/infopath/2007/PartnerControls">
+  <documentManagement>
+    <lcf76f155ced4ddcb4097134ff3c332f xmlns="cca9fd2d-ef84-45c9-8063-8f4bd4c29606">
+      <Terms xmlns="http://schemas.microsoft.com/office/infopath/2007/PartnerControls"/>
+    </lcf76f155ced4ddcb4097134ff3c332f>
+  </documentManagement>
+</p:properties>
 </file>
 
 <file path=customXml/item2.xml><?xml version="1.0" encoding="utf-8"?>
-<ct:contentTypeSchema xmlns:ct="http://schemas.microsoft.com/office/2006/metadata/contentType" xmlns:ma="http://schemas.microsoft.com/office/2006/metadata/properties/metaAttributes" ct:_="" ma:_="" ma:contentTypeName="Document" ma:contentTypeID="0x0101002C289946819CFF499E91D197BC975371" ma:contentTypeVersion="13" ma:contentTypeDescription="Create a new document." ma:contentTypeScope="" ma:versionID="4b388b19620a428294a52af29a503226">
-  <xsd:schema xmlns:xsd="http://www.w3.org/2001/XMLSchema" xmlns:xs="http://www.w3.org/2001/XMLSchema" xmlns:p="http://schemas.microsoft.com/office/2006/metadata/properties" xmlns:ns2="cca9fd2d-ef84-45c9-8063-8f4bd4c29606" xmlns:ns3="18557d39-01b8-4d71-9479-3fad465290ae" targetNamespace="http://schemas.microsoft.com/office/2006/metadata/properties" ma:root="true" ma:fieldsID="f4390916c591314b5f0446846c34d485" ns2:_="" ns3:_="">
+<ct:contentTypeSchema xmlns:ct="http://schemas.microsoft.com/office/2006/metadata/contentType" xmlns:ma="http://schemas.microsoft.com/office/2006/metadata/properties/metaAttributes" ct:_="" ma:_="" ma:contentTypeName="Document" ma:contentTypeID="0x0101002C289946819CFF499E91D197BC975371" ma:contentTypeVersion="13" ma:contentTypeDescription="Create a new document." ma:contentTypeScope="" ma:versionID="674b7a4e239a9748c7aaa97e309327a4">
+  <xsd:schema xmlns:xsd="http://www.w3.org/2001/XMLSchema" xmlns:xs="http://www.w3.org/2001/XMLSchema" xmlns:p="http://schemas.microsoft.com/office/2006/metadata/properties" xmlns:ns2="cca9fd2d-ef84-45c9-8063-8f4bd4c29606" xmlns:ns3="18557d39-01b8-4d71-9479-3fad465290ae" targetNamespace="http://schemas.microsoft.com/office/2006/metadata/properties" ma:root="true" ma:fieldsID="600253478e594d1349e02792803dc53a" ns2:_="" ns3:_="">
     <xsd:import namespace="cca9fd2d-ef84-45c9-8063-8f4bd4c29606"/>
     <xsd:import namespace="18557d39-01b8-4d71-9479-3fad465290ae"/>
     <xsd:element name="properties">
@@ -3236,28 +2817,15 @@
 </file>
 
 <file path=customXml/item3.xml><?xml version="1.0" encoding="utf-8"?>
-<p:properties xmlns:p="http://schemas.microsoft.com/office/2006/metadata/properties" xmlns:xsi="http://www.w3.org/2001/XMLSchema-instance" xmlns:pc="http://schemas.microsoft.com/office/infopath/2007/PartnerControls">
-  <documentManagement>
-    <lcf76f155ced4ddcb4097134ff3c332f xmlns="cca9fd2d-ef84-45c9-8063-8f4bd4c29606">
-      <Terms xmlns="http://schemas.microsoft.com/office/infopath/2007/PartnerControls"/>
-    </lcf76f155ced4ddcb4097134ff3c332f>
-  </documentManagement>
-</p:properties>
+<?mso-contentType ?>
+<FormTemplates xmlns="http://schemas.microsoft.com/sharepoint/v3/contenttype/forms">
+  <Display>DocumentLibraryForm</Display>
+  <Edit>DocumentLibraryForm</Edit>
+  <New>DocumentLibraryForm</New>
+</FormTemplates>
 </file>
 
 <file path=customXml/itemProps1.xml><?xml version="1.0" encoding="utf-8"?>
-<ds:datastoreItem xmlns:ds="http://schemas.openxmlformats.org/officeDocument/2006/customXml" ds:itemID="{CAF70F1B-0EEF-45D1-8902-F367EFB51588}">
-  <ds:schemaRefs>
-    <ds:schemaRef ds:uri="http://schemas.microsoft.com/sharepoint/v3/contenttype/forms"/>
-  </ds:schemaRefs>
-</ds:datastoreItem>
-</file>
-
-<file path=customXml/itemProps2.xml><?xml version="1.0" encoding="utf-8"?>
-<ds:datastoreItem xmlns:ds="http://schemas.openxmlformats.org/officeDocument/2006/customXml" ds:itemID="{9BAEB2E5-7B60-46FD-8639-644CE19CB0B1}"/>
-</file>
-
-<file path=customXml/itemProps3.xml><?xml version="1.0" encoding="utf-8"?>
 <ds:datastoreItem xmlns:ds="http://schemas.openxmlformats.org/officeDocument/2006/customXml" ds:itemID="{5BFD15E7-98A2-452B-BC24-AC8D9E2C41E2}">
   <ds:schemaRefs>
     <ds:schemaRef ds:uri="http://schemas.microsoft.com/office/2006/metadata/properties"/>
@@ -3265,4 +2833,16 @@
     <ds:schemaRef ds:uri="cca9fd2d-ef84-45c9-8063-8f4bd4c29606"/>
   </ds:schemaRefs>
 </ds:datastoreItem>
+</file>
+
+<file path=customXml/itemProps2.xml><?xml version="1.0" encoding="utf-8"?>
+<ds:datastoreItem xmlns:ds="http://schemas.openxmlformats.org/officeDocument/2006/customXml" ds:itemID="{C572DD4E-DC86-4634-96FB-CF83DE5F6EE8}"/>
+</file>
+
+<file path=customXml/itemProps3.xml><?xml version="1.0" encoding="utf-8"?>
+<ds:datastoreItem xmlns:ds="http://schemas.openxmlformats.org/officeDocument/2006/customXml" ds:itemID="{CAF70F1B-0EEF-45D1-8902-F367EFB51588}">
+  <ds:schemaRefs>
+    <ds:schemaRef ds:uri="http://schemas.microsoft.com/sharepoint/v3/contenttype/forms"/>
+  </ds:schemaRefs>
+</ds:datastoreItem>
 </file>
</xml_diff>